<commit_message>
Add MiniLM embeddings and a Groq LLM reasoner with offline fallback.
Retrieval now fuses local MiniLM cosine with SAST and CWE relationships, falling back to TF-IDF if the model is missing. The orchestrator keeps TemplateReasoner unless GROQ_API_KEY is set, then routes to an OpenAI-compatible Groq client (llama-3.1-8b-instant).

Co-authored-by: Cursor <cursoragent@cursor.com>
</commit_message>
<xml_diff>
--- a/Thesis Progress Report_RichaVerma_25MCSS02.docx
+++ b/Thesis Progress Report_RichaVerma_25MCSS02.docx
@@ -62,7 +62,7 @@
                 <w:b/>
                 <w:color w:val="16324F"/>
               </w:rPr>
-              <w:t>Research focus: RAG-augmented multi-agent CWE vulnerability detection. Runnable path is seed-only (regex SAST, lexical hybrid retrieval, template reasoner, validator). Cost-aware skip-LLM routing lives in the orchestrator.</w:t>
+              <w:t>Research focus: RAG-augmented multi-agent CWE vulnerability detection. Runnable path is seed-only (regex SAST, MiniLM/TF-IDF hybrid retrieval, template reasoner, optional LLM). Cost-aware routing lives in the orchestrator.</w:t>
             </w:r>
           </w:p>
         </w:tc>
@@ -744,7 +744,7 @@
         <w:spacing w:after="80" w:line="259" w:lineRule="auto"/>
       </w:pPr>
       <w:r>
-        <w:t>Assignments 1–4 and the wired seed pipeline are implemented in the GitHub repository (PRs #1–#9), then reorganized into layered Python packages (modular-layout). Evaluation is seed-only on 12 authored Java units and 18 retrieval queries — not a public benchmark (not Juliet, OWASP Benchmark, or Big-Vul). Neural embeddings and a live LLM reasoner are not implemented. The default path is offline: regex SAST, lexical TF-IDF hybrid retrieval, and a template reasoner.</w:t>
+        <w:t>Assignments 1–4 and the wired seed pipeline are implemented in the GitHub repository (PRs #1–#10), then extended with a MiniLM embedding port and an LLM reasoner (embeddings-llm). Evaluation is seed-only on 12 authored Java units and 18 retrieval queries — not a public benchmark (not Juliet, OWASP Benchmark, or Big-Vul). Live LLM calls wait on OPENAI_API_KEY or CWE_VULN_LLM_API_KEY; without a key the default path is offline (regex SAST, hybrid retrieval with MiniLM or TF-IDF fallback, template reasoner).</w:t>
       </w:r>
     </w:p>
     <w:tbl>
@@ -1146,7 +1146,7 @@
               <w:rPr>
                 <w:sz w:val="16"/>
               </w:rPr>
-              <w:t>Lexical TF-IDF + SAST + CWE relationships, RRF (PR #3). Not neural embeddings.</w:t>
+              <w:t>MiniLM cosine + SAST + CWE relationships, RRF. TF-IDF fallback if MiniLM missing.</w:t>
             </w:r>
           </w:p>
         </w:tc>
@@ -1194,7 +1194,7 @@
               <w:rPr>
                 <w:sz w:val="16"/>
               </w:rPr>
-              <w:t>Orchestrator SAST-first skip-LLM (PR #8).</w:t>
+              <w:t>Orchestrator SAST-first; LLM only if OPENAI_API_KEY or CWE_VULN_LLM_API_KEY is set.</w:t>
             </w:r>
           </w:p>
         </w:tc>
@@ -1242,7 +1242,7 @@
               <w:rPr>
                 <w:sz w:val="16"/>
               </w:rPr>
-              <w:t>Reasoner, validator, framework CLI (PRs #6, #7, #9).</w:t>
+              <w:t>Template + LLM reasoner, validator, framework CLI.</w:t>
             </w:r>
           </w:p>
         </w:tc>
@@ -1290,7 +1290,7 @@
               <w:rPr>
                 <w:sz w:val="16"/>
               </w:rPr>
-              <w:t>Layered packages; seed-only metrics recorded. No public benchmark.</w:t>
+              <w:t>Embeddings + LLM structure landed. Live LLM waits on key. Seed-only.</w:t>
             </w:r>
           </w:p>
         </w:tc>
@@ -1345,15 +1345,15 @@
               <w:br/>
               <w:t xml:space="preserve">  sast/            regex detect + extract_evidence</w:t>
               <w:br/>
-              <w:t xml:space="preserve">  retrieval/       TF-IDF + SAST + relationships + RRF</w:t>
+              <w:t xml:space="preserve">  retrieval/       MiniLM Embedder + TF-IDF fallback + SAST + RRF</w:t>
               <w:br/>
               <w:t xml:space="preserve">  schema/          JSON Schema validate helpers</w:t>
               <w:br/>
-              <w:t xml:space="preserve">  reasoner/        TemplateReasoner</w:t>
+              <w:t xml:space="preserve">  reasoner/        TemplateReasoner + LLMReasoner</w:t>
               <w:br/>
               <w:t xml:space="preserve">  validator/       ResultValidator</w:t>
               <w:br/>
-              <w:t xml:space="preserve">  orchestrator/    Pipeline, skip-LLM policy</w:t>
+              <w:t xml:space="preserve">  orchestrator/    Pipeline, LLM routing if API key present</w:t>
               <w:br/>
               <w:t xml:space="preserve">  framework/       cwe-vuln-pipeline CLI</w:t>
               <w:br/>
@@ -1556,7 +1556,7 @@
         <w:spacing w:after="80" w:line="259" w:lineRule="auto"/>
       </w:pPr>
       <w:r>
-        <w:t>The implemented architecture combines regex SAST evidence, lexical hybrid CWE retrieval, a cost-aware orchestrator, a template reasoning composer, and a validator. LLM reasoning is specified as an optional later path; the running system skips it when no API key is set or when SAST evidence is already present.</w:t>
+        <w:t>The implemented architecture combines regex SAST evidence, hybrid CWE retrieval (MiniLM cosine with TF-IDF fallback, SAST ids, CWE relationships, RRF), a cost-aware orchestrator, a template reasoner, an LLMReasoner behind the same port, and a validator. Without OPENAI_API_KEY or CWE_VULN_LLM_API_KEY the LLM is not constructed.</w:t>
       </w:r>
     </w:p>
     <w:tbl>
@@ -2166,7 +2166,7 @@
         <w:spacing w:after="80" w:line="259" w:lineRule="auto"/>
       </w:pPr>
       <w:r>
-        <w:t>The hybrid retrieval layer ranks curated CWE entries using lexical TF-IDF cosine, SAST-matched CWE ids, and one-hop CWE relationships, fused with Reciprocal Rank Fusion. This is a lexical vector space, not neural MiniLM embeddings. Retrieval confidence is not used as a vulnerability decision.</w:t>
+        <w:t>The hybrid retrieval layer ranks curated CWE entries using MiniLM cosine when the local all-MiniLM-L6-v2 model is available, otherwise TF-IDF, plus SAST-matched CWE ids and one-hop CWE relationships, fused with Reciprocal Rank Fusion. If MiniLM cannot load, results record embedder=tfidf_fallback. Retrieval confidence is not a vulnerability decision.</w:t>
       </w:r>
     </w:p>
     <w:p>
@@ -2174,7 +2174,7 @@
         <w:spacing w:after="80" w:line="259" w:lineRule="auto"/>
       </w:pPr>
       <w:r>
-        <w:t>The cost-aware orchestrator runs SAST first. If evidence exists, or if no API key is configured (CWE_VULN_LLM_API_KEY / OPENAI_API_KEY), the LLM is skipped. The running reasoner is a deterministic template composer that emits Assignment 4 JSON Schema output.</w:t>
+        <w:t>The cost-aware orchestrator runs SAST first. If no OPENAI_API_KEY or CWE_VULN_LLM_API_KEY is set, the LLM is skipped and TemplateReasoner runs. With a key, the path is sast_then_llm or hybrid_retrieve_then_llm unless skip_llm_when_sast_hits is set. Default model is llama-3.1-8b-instant; CWE_VULN_LLM_BASE_URL can point at an OpenAI-compatible endpoint.</w:t>
       </w:r>
     </w:p>
     <w:p>
@@ -2272,7 +2272,7 @@
         <w:spacing w:after="80" w:line="259" w:lineRule="auto"/>
       </w:pPr>
       <w:r>
-        <w:t>The seed pipeline is implemented and runnable: uv sync &amp;&amp; uv run pytest &amp;&amp; uv run cwe-vuln-pipeline. Recorded seed-only scores: Assignment 1 detection on 12 units P=R=F1=1.000 (tp=6 fp=0 tn=6 fn=0); Assignment 3 hybrid_rrf on 18 queries R@1=0.778 R@3=0.944 R@5=1.000 MRR=0.872; framework test split (4 units) P=R=F1=1.000, validator 4/4, paths sast_first_skip_llm=2 and hybrid_retrieve_skip_llm=2. Remaining work is neural embeddings, a live LLM reasoner, and any later public-benchmark evaluation — none of those are claimed here.</w:t>
+        <w:t>The seed pipeline is implemented and runnable: uv sync &amp;&amp; uv run pytest &amp;&amp; uv run cwe-vuln-pipeline. Recorded seed-only scores: Assignment 1 detection on 12 units P=R=F1=1.000 (tp=6 fp=0 tn=6 fn=0); Assignment 3 retrieval on 18 queries is recorded in results/assignment-3-retrieval.json (seed-only, not a benchmark); framework test split (4 units, no API key) P=R=F1=1.000, validator 4/4, paths sast_first_skip_llm=2 and hybrid_retrieve_skip_llm=2. Neural embeddings and LLM reasoner structure have landed; live LLM calls wait on OPENAI_API_KEY or CWE_VULN_LLM_API_KEY. Public-benchmark evaluation is not claimed.</w:t>
       </w:r>
     </w:p>
     <w:tbl>
@@ -2578,7 +2578,7 @@
               <w:rPr>
                 <w:sz w:val="16"/>
               </w:rPr>
-              <w:t>Optional later: MiniLM embeddings if they install cleanly.</w:t>
+              <w:t>MiniLM with TF-IDF fallback; seed-only metrics in results/.</w:t>
             </w:r>
           </w:p>
         </w:tc>
@@ -2626,7 +2626,7 @@
               <w:rPr>
                 <w:sz w:val="16"/>
               </w:rPr>
-              <w:t>SAST-first skip-LLM; live LLM still unimplemented.</w:t>
+              <w:t>SAST-first; LLM path when OPENAI_API_KEY or CWE_VULN_LLM_API_KEY is set.</w:t>
             </w:r>
           </w:p>
         </w:tc>
@@ -2660,7 +2660,7 @@
               <w:rPr>
                 <w:sz w:val="16"/>
               </w:rPr>
-              <w:t>Implemented (template)</w:t>
+              <w:t>Implemented</w:t>
             </w:r>
           </w:p>
         </w:tc>
@@ -2674,7 +2674,7 @@
               <w:rPr>
                 <w:sz w:val="16"/>
               </w:rPr>
-              <w:t>Optional later: real LLM client if an API key is available.</w:t>
+              <w:t>Template offline; LLMReasoner (default llama-3.1-8b-instant).</w:t>
             </w:r>
           </w:p>
         </w:tc>
@@ -2907,7 +2907,7 @@
         <w:ind w:left="259" w:hanging="173"/>
       </w:pPr>
       <w:r>
-        <w:t>Optional later: swap TF-IDF for a local MiniLM encoder if embeddings can be installed offline.</w:t>
+        <w:t>MiniLM embeddings are implemented with TF-IDF fallback if the local model is missing.</w:t>
       </w:r>
     </w:p>
     <w:p>
@@ -2927,7 +2927,7 @@
         <w:ind w:left="259" w:hanging="173"/>
       </w:pPr>
       <w:r>
-        <w:t>Keep SAST-first skip-LLM routing in the orchestrator unless a real API key path is added.</w:t>
+        <w:t>Keep SAST-first LLM routing in the orchestrator (OPENAI_API_KEY).</w:t>
       </w:r>
     </w:p>
     <w:p>
@@ -2937,7 +2937,7 @@
         <w:ind w:left="259" w:hanging="173"/>
       </w:pPr>
       <w:r>
-        <w:t>Optional later: implement a live LLM reasoner behind CWE_VULN_LLM_API_KEY / OPENAI_API_KEY; do not fake outputs.</w:t>
+        <w:t>Live LLM reasoner is implemented; tomorrow export GROQ_API_KEY or CWE_VULN_LLM_API_KEY.</w:t>
       </w:r>
     </w:p>
     <w:p>
@@ -3007,7 +3007,7 @@
         <w:spacing w:after="80" w:line="259" w:lineRule="auto"/>
       </w:pPr>
       <w:r>
-        <w:t>The thesis has progressed from study of Explainable AI, RAG and agentic systems to a runnable seed-only pipeline for explainable CWE-oriented vulnerability detection. The implemented path combines a curated CWE knowledge store, lexical hybrid retrieval, regex SAST evidence, a template reasoner, validation, and cost-aware skip-LLM routing.</w:t>
+        <w:t>The thesis has progressed from study of Explainable AI, RAG and agentic systems to a runnable seed-only pipeline for explainable CWE-oriented vulnerability detection. The implemented path combines a curated CWE knowledge store, MiniLM/TF-IDF hybrid retrieval, regex SAST evidence, a template reasoner, an LLM path gated on OPENAI_API_KEY or CWE_VULN_LLM_API_KEY, validation, and cost-aware orchestrator routing.</w:t>
       </w:r>
     </w:p>
     <w:p>
@@ -3015,7 +3015,7 @@
         <w:spacing w:after="80" w:line="259" w:lineRule="auto"/>
       </w:pPr>
       <w:r>
-        <w:t>Current work establishes the problem, layered architecture, and a complete offline seed pipeline with recorded seed-only metrics. Neural embeddings, a live LLM reasoner, and public-benchmark evaluation remain future work and are not reported as done.</w:t>
+        <w:t>Current work establishes the problem, layered architecture, MiniLM embeddings with TF-IDF fallback, and an LLM reasoner that stays offline without an API key. Public-benchmark evaluation remains future work and is not reported as done.</w:t>
       </w:r>
     </w:p>
     <w:tbl>
@@ -3045,7 +3045,7 @@
                 <w:b/>
                 <w:color w:val="16324F"/>
               </w:rPr>
-              <w:t>Progress summary: XAI → RAG → CWE knowledge → agentic AI → Java seed + SAST baseline → hybrid lexical retrieval → schema → evidence → template reasoner → validator → orchestrator → framework CLI → layered packages. Remaining: neural embeddings, live LLM, public-benchmark evaluation.</w:t>
+              <w:t>Progress summary: XAI → RAG → CWE knowledge → agentic AI → Java seed + SAST baseline → hybrid retrieval → schema → evidence → template reasoner → validator → orchestrator → framework CLI → layered packages → MiniLM embeddings + LLM structure. Live LLM waits on OPENAI_API_KEY. Public-benchmark evaluation remains later.</w:t>
             </w:r>
           </w:p>
         </w:tc>

</xml_diff>

<commit_message>
Gate the LLM reasoner on OPENAI_API_KEY with an OpenAI-compatible fallback.
Keep MiniLM retrieval and the template offline path; construct LLMReasoner only when CWE_VULN_LLM_API_KEY or OPENAI_API_KEY is set.

Co-authored-by: Cursor <cursoragent@cursor.com>
</commit_message>
<xml_diff>
--- a/Thesis Progress Report_RichaVerma_25MCSS02.docx
+++ b/Thesis Progress Report_RichaVerma_25MCSS02.docx
@@ -2174,7 +2174,7 @@
         <w:spacing w:after="80" w:line="259" w:lineRule="auto"/>
       </w:pPr>
       <w:r>
-        <w:t>The cost-aware orchestrator runs SAST first. If no OPENAI_API_KEY or CWE_VULN_LLM_API_KEY is set, the LLM is skipped and TemplateReasoner runs. With a key, the path is sast_then_llm or hybrid_retrieve_then_llm unless skip_llm_when_sast_hits is set. Default model is llama-3.1-8b-instant; CWE_VULN_LLM_BASE_URL can point at an OpenAI-compatible endpoint.</w:t>
+        <w:t>The cost-aware orchestrator runs SAST first. If no OPENAI_API_KEY or CWE_VULN_LLM_API_KEY is set, the LLM is skipped and TemplateReasoner runs. With a key, the path is sast_then_llm or hybrid_retrieve_then_llm unless skip_llm_when_sast_hits is set. Default model is gpt-4o-mini; CWE_VULN_LLM_BASE_URL can point at an OpenAI-compatible endpoint.</w:t>
       </w:r>
     </w:p>
     <w:p>
@@ -2674,7 +2674,7 @@
               <w:rPr>
                 <w:sz w:val="16"/>
               </w:rPr>
-              <w:t>Template offline; LLMReasoner (default llama-3.1-8b-instant).</w:t>
+              <w:t>Template offline; LLMReasoner (default gpt-4o-mini).</w:t>
             </w:r>
           </w:p>
         </w:tc>
@@ -2937,7 +2937,7 @@
         <w:ind w:left="259" w:hanging="173"/>
       </w:pPr>
       <w:r>
-        <w:t>Live LLM reasoner is implemented; tomorrow export GROQ_API_KEY or CWE_VULN_LLM_API_KEY.</w:t>
+        <w:t>Live LLM reasoner is implemented; tomorrow export OPENAI_API_KEY or CWE_VULN_LLM_API_KEY.</w:t>
       </w:r>
     </w:p>
     <w:p>

</xml_diff>

<commit_message>
Align remaining docs with Groq, MiniLM, and offline fallbacks.
Stop telling readers neural RAG and the live reasoner are unimplemented, and drop OpenAI as the primary LLM path.

Co-authored-by: Cursor <cursoragent@cursor.com>
</commit_message>
<xml_diff>
--- a/Thesis Progress Report_RichaVerma_25MCSS02.docx
+++ b/Thesis Progress Report_RichaVerma_25MCSS02.docx
@@ -744,7 +744,7 @@
         <w:spacing w:after="80" w:line="259" w:lineRule="auto"/>
       </w:pPr>
       <w:r>
-        <w:t>Assignments 1–4 and the wired seed pipeline are implemented in the GitHub repository (PRs #1–#10), then extended with a MiniLM embedding port and an LLM reasoner (embeddings-llm). Evaluation is seed-only on 12 authored Java units and 18 retrieval queries — not a public benchmark (not Juliet, OWASP Benchmark, or Big-Vul). Live LLM calls wait on OPENAI_API_KEY or CWE_VULN_LLM_API_KEY; without a key the default path is offline (regex SAST, hybrid retrieval with MiniLM or TF-IDF fallback, template reasoner).</w:t>
+        <w:t>Assignments 1–4 and the wired seed pipeline are implemented in the GitHub repository (PRs #1–#10), then extended with a MiniLM embedding port and an LLM reasoner (embeddings-llm). Evaluation is seed-only on 12 authored Java units and 18 retrieval queries — not a public benchmark (not Juliet, OWASP Benchmark, or Big-Vul). Live LLM calls wait on GROQ_API_KEY (optional CWE_VULN_LLM_API_KEY override); without a key the default path is offline (regex SAST, hybrid retrieval with MiniLM or TF-IDF fallback, template reasoner). No OpenAI account is required; OPENAI_API_KEY is unused.</w:t>
       </w:r>
     </w:p>
     <w:tbl>
@@ -1194,7 +1194,7 @@
               <w:rPr>
                 <w:sz w:val="16"/>
               </w:rPr>
-              <w:t>Orchestrator SAST-first; LLM only if OPENAI_API_KEY or CWE_VULN_LLM_API_KEY is set.</w:t>
+              <w:t>Orchestrator SAST-first; Groq LLM only if GROQ_API_KEY is set (CWE_VULN_LLM_API_KEY override).</w:t>
             </w:r>
           </w:p>
         </w:tc>
@@ -1556,7 +1556,7 @@
         <w:spacing w:after="80" w:line="259" w:lineRule="auto"/>
       </w:pPr>
       <w:r>
-        <w:t>The implemented architecture combines regex SAST evidence, hybrid CWE retrieval (MiniLM cosine with TF-IDF fallback, SAST ids, CWE relationships, RRF), a cost-aware orchestrator, a template reasoner, an LLMReasoner behind the same port, and a validator. Without OPENAI_API_KEY or CWE_VULN_LLM_API_KEY the LLM is not constructed.</w:t>
+        <w:t>The implemented architecture combines regex SAST evidence, hybrid CWE retrieval (MiniLM cosine with TF-IDF fallback, SAST ids, CWE relationships, RRF), a cost-aware orchestrator, a template reasoner, an LLMReasoner behind the same port, and a validator. Without GROQ_API_KEY (or CWE_VULN_LLM_API_KEY override) the LLM is not constructed. No OpenAI account is required; OPENAI_API_KEY is unused.</w:t>
       </w:r>
     </w:p>
     <w:tbl>
@@ -2174,7 +2174,7 @@
         <w:spacing w:after="80" w:line="259" w:lineRule="auto"/>
       </w:pPr>
       <w:r>
-        <w:t>The cost-aware orchestrator runs SAST first. If no OPENAI_API_KEY or CWE_VULN_LLM_API_KEY is set, the LLM is skipped and TemplateReasoner runs. With a key, the path is sast_then_llm or hybrid_retrieve_then_llm unless skip_llm_when_sast_hits is set. Default model is gpt-4o-mini; CWE_VULN_LLM_BASE_URL can point at an OpenAI-compatible endpoint.</w:t>
+        <w:t>The cost-aware orchestrator runs SAST first. If no GROQ_API_KEY or CWE_VULN_LLM_API_KEY is set, the LLM is skipped and TemplateReasoner runs. With a key, the path is sast_then_llm or hybrid_retrieve_then_llm unless skip_llm_when_sast_hits is set. Default model is Groq llama-3.1-8b-instant at https://api.groq.com/openai/v1. No OpenAI account is required; OPENAI_API_KEY is unused.</w:t>
       </w:r>
     </w:p>
     <w:p>
@@ -2272,7 +2272,7 @@
         <w:spacing w:after="80" w:line="259" w:lineRule="auto"/>
       </w:pPr>
       <w:r>
-        <w:t>The seed pipeline is implemented and runnable: uv sync &amp;&amp; uv run pytest &amp;&amp; uv run cwe-vuln-pipeline. Recorded seed-only scores: Assignment 1 detection on 12 units P=R=F1=1.000 (tp=6 fp=0 tn=6 fn=0); Assignment 3 retrieval on 18 queries is recorded in results/assignment-3-retrieval.json (seed-only, not a benchmark); framework test split (4 units, no API key) P=R=F1=1.000, validator 4/4, paths sast_first_skip_llm=2 and hybrid_retrieve_skip_llm=2. Neural embeddings and LLM reasoner structure have landed; live LLM calls wait on OPENAI_API_KEY or CWE_VULN_LLM_API_KEY. Public-benchmark evaluation is not claimed.</w:t>
+        <w:t>The seed pipeline is implemented and runnable: uv sync &amp;&amp; uv run pytest &amp;&amp; uv run cwe-vuln-pipeline. Recorded seed-only scores: Assignment 1 detection on 12 units P=R=F1=1.000 (tp=6 fp=0 tn=6 fn=0); Assignment 3 retrieval on 18 queries is recorded in results/assignment-3-retrieval.json (seed-only, not a benchmark); framework test split (4 units, no API key) P=R=F1=1.000, validator 4/4, paths sast_first_skip_llm=2 and hybrid_retrieve_skip_llm=2. Neural embeddings and the Groq LLM reasoner have landed; live LLM calls wait on GROQ_API_KEY. Public-benchmark evaluation is not claimed.</w:t>
       </w:r>
     </w:p>
     <w:tbl>
@@ -2626,7 +2626,7 @@
               <w:rPr>
                 <w:sz w:val="16"/>
               </w:rPr>
-              <w:t>SAST-first; LLM path when OPENAI_API_KEY or CWE_VULN_LLM_API_KEY is set.</w:t>
+              <w:t>SAST-first; LLM path when GROQ_API_KEY or CWE_VULN_LLM_API_KEY is set.</w:t>
             </w:r>
           </w:p>
         </w:tc>
@@ -2674,7 +2674,7 @@
               <w:rPr>
                 <w:sz w:val="16"/>
               </w:rPr>
-              <w:t>Template offline; LLMReasoner (default gpt-4o-mini).</w:t>
+              <w:t>Template offline; LLMReasoner (default llama-3.1-8b-instant).</w:t>
             </w:r>
           </w:p>
         </w:tc>
@@ -2927,7 +2927,7 @@
         <w:ind w:left="259" w:hanging="173"/>
       </w:pPr>
       <w:r>
-        <w:t>Keep SAST-first LLM routing in the orchestrator (OPENAI_API_KEY).</w:t>
+        <w:t>Keep SAST-first LLM routing in the orchestrator (GROQ_API_KEY).</w:t>
       </w:r>
     </w:p>
     <w:p>
@@ -2937,7 +2937,7 @@
         <w:ind w:left="259" w:hanging="173"/>
       </w:pPr>
       <w:r>
-        <w:t>Live LLM reasoner is implemented; tomorrow export OPENAI_API_KEY or CWE_VULN_LLM_API_KEY.</w:t>
+        <w:t>Live LLM reasoner is implemented; tomorrow export GROQ_API_KEY or CWE_VULN_LLM_API_KEY.</w:t>
       </w:r>
     </w:p>
     <w:p>
@@ -3007,7 +3007,7 @@
         <w:spacing w:after="80" w:line="259" w:lineRule="auto"/>
       </w:pPr>
       <w:r>
-        <w:t>The thesis has progressed from study of Explainable AI, RAG and agentic systems to a runnable seed-only pipeline for explainable CWE-oriented vulnerability detection. The implemented path combines a curated CWE knowledge store, MiniLM/TF-IDF hybrid retrieval, regex SAST evidence, a template reasoner, an LLM path gated on OPENAI_API_KEY or CWE_VULN_LLM_API_KEY, validation, and cost-aware orchestrator routing.</w:t>
+        <w:t>The thesis has progressed from study of Explainable AI, RAG and agentic systems to a runnable seed-only pipeline for explainable CWE-oriented vulnerability detection. The implemented path combines a curated CWE knowledge store, MiniLM/TF-IDF hybrid retrieval, regex SAST evidence, a template reasoner, an LLM path gated on GROQ_API_KEY or CWE_VULN_LLM_API_KEY, validation, and cost-aware orchestrator routing.</w:t>
       </w:r>
     </w:p>
     <w:p>
@@ -3045,7 +3045,7 @@
                 <w:b/>
                 <w:color w:val="16324F"/>
               </w:rPr>
-              <w:t>Progress summary: XAI → RAG → CWE knowledge → agentic AI → Java seed + SAST baseline → hybrid retrieval → schema → evidence → template reasoner → validator → orchestrator → framework CLI → layered packages → MiniLM embeddings + LLM structure. Live LLM waits on OPENAI_API_KEY. Public-benchmark evaluation remains later.</w:t>
+              <w:t>Progress summary: XAI → RAG → CWE knowledge → agentic AI → Java seed + SAST baseline → hybrid retrieval → schema → evidence → template reasoner → validator → orchestrator → framework CLI → layered packages → MiniLM embeddings + LLM structure. Live Groq waits on GROQ_API_KEY. Public-benchmark evaluation remains later.</w:t>
             </w:r>
           </w:p>
         </w:tc>

</xml_diff>

<commit_message>
Evaluate the authored expanded Java corpus so regex SAST can fail.
Keep the Assignment 1 8/4 seed, add 24 held-out FP/FN traps, and record live Groq and retrieval ablations on that split without claiming a public benchmark.

Co-authored-by: Cursor <cursoragent@cursor.com>
</commit_message>
<xml_diff>
--- a/Thesis Progress Report_RichaVerma_25MCSS02.docx
+++ b/Thesis Progress Report_RichaVerma_25MCSS02.docx
@@ -744,7 +744,7 @@
         <w:spacing w:after="80" w:line="259" w:lineRule="auto"/>
       </w:pPr>
       <w:r>
-        <w:t>Assignments 1–4 and the wired seed pipeline are implemented in the GitHub repository (PRs #1–#10), then extended with a MiniLM embedding port and an LLM reasoner (embeddings-llm). Evaluation is seed-only on 12 authored Java units and 18 retrieval queries — not a public benchmark (not Juliet, OWASP Benchmark, or Big-Vul). Live LLM calls wait on GROQ_API_KEY (optional CWE_VULN_LLM_API_KEY override); without a key the default path is offline (regex SAST, hybrid retrieval with MiniLM or TF-IDF fallback, template reasoner). No OpenAI account is required; OPENAI_API_KEY is unused.</w:t>
+        <w:t>Assignments 1–4 and the wired seed pipeline are implemented (PRs #1–#10), then MiniLM embeddings and a Groq LLM reasoner (embeddings-llm). Research evaluation is complete on an authored expanded Java corpus (36 units: original 12 plus 24 held-out FP/FN traps) — not a public benchmark (not Juliet, OWASP Benchmark, or Big-Vul). Live Groq openai/gpt-oss-20b was used in trials. Without GROQ_API_KEY the default path is offline. No OpenAI account is required.</w:t>
       </w:r>
     </w:p>
     <w:tbl>
@@ -1276,7 +1276,7 @@
               <w:rPr>
                 <w:sz w:val="16"/>
               </w:rPr>
-              <w:t>Seed pipeline done</w:t>
+              <w:t>Research eval done</w:t>
             </w:r>
           </w:p>
         </w:tc>
@@ -1290,7 +1290,7 @@
               <w:rPr>
                 <w:sz w:val="16"/>
               </w:rPr>
-              <w:t>Embeddings + LLM structure landed. Live LLM waits on key. Seed-only.</w:t>
+              <w:t>Authored 36-unit corpus. Live Groq trials recorded. Not a public benchmark.</w:t>
             </w:r>
           </w:p>
         </w:tc>
@@ -1339,7 +1339,7 @@
               <w:br/>
               <w:t xml:space="preserve">  models/          Evidence, RankedHit, ReasoningResult, ValidationReport, metrics</w:t>
               <w:br/>
-              <w:t xml:space="preserve">  dataset/         SeedUnit, load_seed, 8/4 split</w:t>
+              <w:t xml:space="preserve">  dataset/         SeedUnit, load_seed 8/4, load_research_corpus 36</w:t>
               <w:br/>
               <w:t xml:space="preserve">  knowledge/       CWEKnowledgeBase</w:t>
               <w:br/>
@@ -1355,7 +1355,7 @@
               <w:br/>
               <w:t xml:space="preserve">  orchestrator/    Pipeline, LLM routing if API key present</w:t>
               <w:br/>
-              <w:t xml:space="preserve">  framework/       cwe-vuln-pipeline CLI</w:t>
+              <w:t xml:space="preserve">  framework/       cwe-vuln-pipeline + cwe-vuln-eval</w:t>
               <w:br/>
               <w:t xml:space="preserve">  cli/             baseline, kb, retrieve, schema, evidence</w:t>
               <w:br/>
@@ -2174,7 +2174,7 @@
         <w:spacing w:after="80" w:line="259" w:lineRule="auto"/>
       </w:pPr>
       <w:r>
-        <w:t>The cost-aware orchestrator runs SAST first. If no GROQ_API_KEY or CWE_VULN_LLM_API_KEY is set, the LLM is skipped and TemplateReasoner runs. With a key, the path is sast_then_llm or hybrid_retrieve_then_llm unless skip_llm_when_sast_hits is set. Default model is Groq llama-3.1-8b-instant at https://api.groq.com/openai/v1. No OpenAI account is required; OPENAI_API_KEY is unused.</w:t>
+        <w:t>The cost-aware orchestrator runs SAST first. If no GROQ_API_KEY or CWE_VULN_LLM_API_KEY is set, the LLM is skipped and TemplateReasoner runs. With a key, the path is sast_then_llm or hybrid_retrieve_then_llm unless skip_llm_when_sast_hits is set. Default model is Groq openai/gpt-oss-20b at https://api.groq.com/openai/v1. No OpenAI account is required; OPENAI_API_KEY is unused.</w:t>
       </w:r>
     </w:p>
     <w:p>
@@ -2272,7 +2272,7 @@
         <w:spacing w:after="80" w:line="259" w:lineRule="auto"/>
       </w:pPr>
       <w:r>
-        <w:t>The seed pipeline is implemented and runnable: uv sync &amp;&amp; uv run pytest &amp;&amp; uv run cwe-vuln-pipeline. Recorded seed-only scores: Assignment 1 detection on 12 units P=R=F1=1.000 (tp=6 fp=0 tn=6 fn=0); Assignment 3 retrieval on 18 queries is recorded in results/assignment-3-retrieval.json (seed-only, not a benchmark); framework test split (4 units, no API key) P=R=F1=1.000, validator 4/4, paths sast_first_skip_llm=2 and hybrid_retrieve_skip_llm=2. Neural embeddings and the Groq LLM reasoner have landed; live LLM calls wait on GROQ_API_KEY. Public-benchmark evaluation is not claimed.</w:t>
+        <w:t>The seed pipeline is implemented and runnable: uv sync &amp;&amp; uv run pytest &amp;&amp; uv run cwe-vuln-pipeline. Assignment 1 detection on 12 units P=R=F1=1.000 (seed-only). Research evaluation on 24 held-out authored traps: SAST/template P=R=F1=0.000 (12 FP / 12 FN); live Groq then_llm P=0.857 R=1.000 F1=0.923; skip_llm P=0.500 R=1.000 F1=0.667. Retrieval on 48 authored queries: hybrid R@1=0.854 MRR=0.917 vs MiniLM 0.812 / 0.894 vs TF-IDF 0.646 / 0.794. Public-benchmark evaluation is not claimed.</w:t>
       </w:r>
     </w:p>
     <w:tbl>
@@ -2674,7 +2674,7 @@
               <w:rPr>
                 <w:sz w:val="16"/>
               </w:rPr>
-              <w:t>Template offline; LLMReasoner (default llama-3.1-8b-instant).</w:t>
+              <w:t>Template offline; LLMReasoner (default openai/gpt-oss-20b).</w:t>
             </w:r>
           </w:p>
         </w:tc>
@@ -2852,7 +2852,7 @@
               <w:rPr>
                 <w:sz w:val="16"/>
               </w:rPr>
-              <w:t>Seed-only</w:t>
+              <w:t>Authored corpus</w:t>
             </w:r>
           </w:p>
         </w:tc>
@@ -2866,7 +2866,7 @@
               <w:rPr>
                 <w:sz w:val="16"/>
               </w:rPr>
-              <w:t>No Juliet / OWASP Benchmark / Big-Vul numbers. Do not invent them.</w:t>
+              <w:t>36 units / 24 held-out traps. No Juliet / OWASP Benchmark / Big-Vul numbers.</w:t>
             </w:r>
           </w:p>
         </w:tc>
@@ -2887,7 +2887,7 @@
         <w:ind w:left="259" w:hanging="173"/>
       </w:pPr>
       <w:r>
-        <w:t>Keep the 12-unit Java seed as a pedagogical corpus; do not treat it as Juliet/OWASP Benchmark.</w:t>
+        <w:t>Keep the original 12-unit Java seed as the assignment split; research scores use the 24-unit held-out authored traps.</w:t>
       </w:r>
     </w:p>
     <w:p>
@@ -2937,7 +2937,7 @@
         <w:ind w:left="259" w:hanging="173"/>
       </w:pPr>
       <w:r>
-        <w:t>Live LLM reasoner is implemented; tomorrow export GROQ_API_KEY or CWE_VULN_LLM_API_KEY.</w:t>
+        <w:t>Live LLM reasoner is implemented; research trials used Groq openai/gpt-oss-20b.</w:t>
       </w:r>
     </w:p>
     <w:p>
@@ -2947,7 +2947,7 @@
         <w:ind w:left="259" w:hanging="173"/>
       </w:pPr>
       <w:r>
-        <w:t>Validator already checks schema, CWE id, cited lines, and decision vs evidence.</w:t>
+        <w:t>Validator already checks schema, CWE id, cited lines, and decision vs evidence — it currently fails when the LLM correctly overrides SAST.</w:t>
       </w:r>
     </w:p>
     <w:p>
@@ -3015,7 +3015,7 @@
         <w:spacing w:after="80" w:line="259" w:lineRule="auto"/>
       </w:pPr>
       <w:r>
-        <w:t>Current work establishes the problem, layered architecture, MiniLM embeddings with TF-IDF fallback, and an LLM reasoner that stays offline without an API key. Public-benchmark evaluation remains future work and is not reported as done.</w:t>
+        <w:t>Current work establishes the problem, layered architecture, MiniLM embeddings, an LLM reasoner, and a completed research evaluation on an authored expanded corpus (with limitations: small N, traps written against our regex). Public-benchmark evaluation remains future work and is not reported as done.</w:t>
       </w:r>
     </w:p>
     <w:tbl>
@@ -3045,7 +3045,7 @@
                 <w:b/>
                 <w:color w:val="16324F"/>
               </w:rPr>
-              <w:t>Progress summary: XAI → RAG → CWE knowledge → agentic AI → Java seed + SAST baseline → hybrid retrieval → schema → evidence → template reasoner → validator → orchestrator → framework CLI → layered packages → MiniLM embeddings + LLM structure. Live Groq waits on GROQ_API_KEY. Public-benchmark evaluation remains later.</w:t>
+              <w:t>Progress summary: XAI → RAG → CWE knowledge → agentic AI → Java seed + SAST baseline → hybrid retrieval → schema → evidence → template reasoner → validator → orchestrator → framework CLI → layered packages → MiniLM embeddings + LLM reasoner → research evaluation on an authored expanded corpus. Live Groq used in trials. Public-benchmark evaluation remains later.</w:t>
             </w:r>
           </w:p>
         </w:tc>

</xml_diff>

<commit_message>
Make live Groq the default research path and stop failing the validator on SAST disagreement.
SAST and TemplateReasoner scored F1=0 on the authored trap split; they stay as opt-in ablations. The validator now checks schema, KB, cited lines, and JSON consistency so Groq FN recoveries can pass.

Co-authored-by: Cursor <cursoragent@cursor.com>
</commit_message>
<xml_diff>
--- a/Thesis Progress Report_RichaVerma_25MCSS02.docx
+++ b/Thesis Progress Report_RichaVerma_25MCSS02.docx
@@ -62,7 +62,7 @@
                 <w:b/>
                 <w:color w:val="16324F"/>
               </w:rPr>
-              <w:t>Research focus: RAG-augmented multi-agent CWE vulnerability detection. Runnable path is seed-only (regex SAST, MiniLM/TF-IDF hybrid retrieval, template reasoner, optional LLM). Cost-aware routing lives in the orchestrator.</w:t>
+              <w:t>Research focus: RAG-augmented multi-agent CWE vulnerability detection. The live path is regex SAST evidence, MiniLM/TF-IDF hybrid retrieval, Groq LLMReasoner, and a validator that checks schema/lines/KB rather than SAST agreement. Template/SAST are paper ablations.</w:t>
             </w:r>
           </w:p>
         </w:tc>
@@ -744,7 +744,7 @@
         <w:spacing w:after="80" w:line="259" w:lineRule="auto"/>
       </w:pPr>
       <w:r>
-        <w:t>Assignments 1–4 and the wired seed pipeline are implemented (PRs #1–#10), then MiniLM embeddings and a Groq LLM reasoner (embeddings-llm). Research evaluation is complete on an authored expanded Java corpus (36 units: original 12 plus 24 held-out FP/FN traps) — not a public benchmark (not Juliet, OWASP Benchmark, or Big-Vul). Live Groq openai/gpt-oss-20b was used in trials. Without GROQ_API_KEY the default path is offline. No OpenAI account is required.</w:t>
+        <w:t>Assignments 1–4 and the wired seed pipeline are implemented (PRs #1–#10), then MiniLM embeddings and a Groq LLM reasoner (embeddings-llm). Research evaluation is complete on an authored expanded Java corpus (36 units: original 12 plus 24 held-out FP/FN traps) — not a public benchmark (not Juliet, OWASP Benchmark, or Big-Vul). The system of record is live Groq openai/gpt-oss-20b. SAST-only and TemplateReasoner scored F1=0 on the 24-unit split and are opt-in ablations, not the default path. GROQ_API_KEY is required. No OpenAI account is required.</w:t>
       </w:r>
     </w:p>
     <w:tbl>
@@ -1194,7 +1194,7 @@
               <w:rPr>
                 <w:sz w:val="16"/>
               </w:rPr>
-              <w:t>Orchestrator SAST-first; Groq LLM only if GROQ_API_KEY is set (CWE_VULN_LLM_API_KEY override).</w:t>
+              <w:t>Orchestrator SAST-as-evidence then Groq; GROQ_API_KEY required (CWE_VULN_LLM_API_KEY override).</w:t>
             </w:r>
           </w:p>
         </w:tc>
@@ -1242,7 +1242,7 @@
               <w:rPr>
                 <w:sz w:val="16"/>
               </w:rPr>
-              <w:t>Template + LLM reasoner, validator, framework CLI.</w:t>
+              <w:t>Groq LLMReasoner default; template ablation; validator (schema/lines/KB).</w:t>
             </w:r>
           </w:p>
         </w:tc>
@@ -1276,7 +1276,7 @@
               <w:rPr>
                 <w:sz w:val="16"/>
               </w:rPr>
-              <w:t>Research eval done</w:t>
+              <w:t>Live research</w:t>
             </w:r>
           </w:p>
         </w:tc>
@@ -1290,7 +1290,7 @@
               <w:rPr>
                 <w:sz w:val="16"/>
               </w:rPr>
-              <w:t>Authored 36-unit corpus. Live Groq trials recorded. Not a public benchmark.</w:t>
+              <w:t>Authored 36-unit corpus. Live Groq is the system of record. Not a public benchmark.</w:t>
             </w:r>
           </w:p>
         </w:tc>
@@ -1353,7 +1353,7 @@
               <w:br/>
               <w:t xml:space="preserve">  validator/       ResultValidator</w:t>
               <w:br/>
-              <w:t xml:space="preserve">  orchestrator/    Pipeline, LLM routing if API key present</w:t>
+              <w:t xml:space="preserve">  orchestrator/    Pipeline.default requires Groq; Pipeline.offline ablation</w:t>
               <w:br/>
               <w:t xml:space="preserve">  framework/       cwe-vuln-pipeline + cwe-vuln-eval</w:t>
               <w:br/>
@@ -1556,7 +1556,7 @@
         <w:spacing w:after="80" w:line="259" w:lineRule="auto"/>
       </w:pPr>
       <w:r>
-        <w:t>The implemented architecture combines regex SAST evidence, hybrid CWE retrieval (MiniLM cosine with TF-IDF fallback, SAST ids, CWE relationships, RRF), a cost-aware orchestrator, a template reasoner, an LLMReasoner behind the same port, and a validator. Without GROQ_API_KEY (or CWE_VULN_LLM_API_KEY override) the LLM is not constructed. No OpenAI account is required; OPENAI_API_KEY is unused.</w:t>
+        <w:t>The implemented architecture combines regex SAST evidence, hybrid CWE retrieval (MiniLM cosine with TF-IDF fallback, SAST ids, CWE relationships, RRF), a cost-aware orchestrator, a Groq LLMReasoner that emits Assignment-4 schema JSON, an optional template reasoner for paper ablations, and a validator. GROQ_API_KEY (or CWE_VULN_LLM_API_KEY override) is required on the default path. No OpenAI account is required; OPENAI_API_KEY is unused. This is not claimed as SOTA or as the first RAG-CWE detector; the contribution is this specific composition on an authored trap split.</w:t>
       </w:r>
     </w:p>
     <w:tbl>
@@ -2174,7 +2174,7 @@
         <w:spacing w:after="80" w:line="259" w:lineRule="auto"/>
       </w:pPr>
       <w:r>
-        <w:t>The cost-aware orchestrator runs SAST first. If no GROQ_API_KEY or CWE_VULN_LLM_API_KEY is set, the LLM is skipped and TemplateReasoner runs. With a key, the path is sast_then_llm or hybrid_retrieve_then_llm unless skip_llm_when_sast_hits is set. Default model is Groq openai/gpt-oss-20b at https://api.groq.com/openai/v1. No OpenAI account is required; OPENAI_API_KEY is unused.</w:t>
+        <w:t>The cost-aware orchestrator always extracts SAST evidence first, then Groq decides. Pipeline.default() requires GROQ_API_KEY or CWE_VULN_LLM_API_KEY; missing key fails clearly. Default paths are sast_then_llm / hybrid_retrieve_then_llm. TemplateReasoner is --offline / --ablation template only (F1=0 on research_test). Default model is Groq openai/gpt-oss-20b at https://api.groq.com/openai/v1. No OpenAI account is required; OPENAI_API_KEY is unused.</w:t>
       </w:r>
     </w:p>
     <w:p>
@@ -2182,7 +2182,7 @@
         <w:spacing w:after="80" w:line="259" w:lineRule="auto"/>
       </w:pPr>
       <w:r>
-        <w:t>The validator checks schema validity, that the cited CWE exists in the knowledge store, that supporting source lines exist in the Java unit, and that the decision is consistent with SAST evidence. Framework metrics compare decisions to seed labels.</w:t>
+        <w:t>The validator checks schema validity, that the cited CWE exists in the knowledge store, that supporting source lines exist in the Java unit, and that the JSON is internally consistent. It does not require the decision to match SAST: empty SAST evidence with a vulnerable Groq decision is a sast_disagreement warning, not a failed unit. Framework metrics compare decisions to labels.</w:t>
       </w:r>
     </w:p>
     <w:p>
@@ -2272,7 +2272,7 @@
         <w:spacing w:after="80" w:line="259" w:lineRule="auto"/>
       </w:pPr>
       <w:r>
-        <w:t>The seed pipeline is implemented and runnable: uv sync &amp;&amp; uv run pytest &amp;&amp; uv run cwe-vuln-pipeline. Assignment 1 detection on 12 units P=R=F1=1.000 (seed-only). Research evaluation on 24 held-out authored traps: SAST/template P=R=F1=0.000 (12 FP / 12 FN); live Groq then_llm P=0.857 R=1.000 F1=0.923; skip_llm P=0.500 R=1.000 F1=0.667. Retrieval on 48 authored queries: hybrid R@1=0.854 MRR=0.917 vs MiniLM 0.812 / 0.894 vs TF-IDF 0.646 / 0.794. Public-benchmark evaluation is not claimed.</w:t>
+        <w:t>The live pipeline is implemented and runnable: uv sync &amp;&amp; uv run pytest &amp;&amp; uv run cwe-vuln-pipeline (requires GROQ_API_KEY). Assignment 1 detection on 12 units P=R=F1=1.000 (seed-only). Research evaluation on 24 held-out authored traps: SAST/template P=R=F1=0.000 (12 FP / 12 FN, ablation); live Groq then_llm P=0.857 R=1.000 F1=0.923, validator 24/24 (was 2/24 under the old SAST-iff-vulnerable rule). Retrieval on 48 authored queries: hybrid R@1=0.854 MRR=0.917 vs MiniLM 0.812 / 0.894 vs TF-IDF 0.646 / 0.794. Public-benchmark evaluation is not claimed.</w:t>
       </w:r>
     </w:p>
     <w:tbl>
@@ -2626,7 +2626,7 @@
               <w:rPr>
                 <w:sz w:val="16"/>
               </w:rPr>
-              <w:t>SAST-first; LLM path when GROQ_API_KEY or CWE_VULN_LLM_API_KEY is set.</w:t>
+              <w:t>SAST evidence then Groq; missing GROQ_API_KEY fails clearly.</w:t>
             </w:r>
           </w:p>
         </w:tc>
@@ -2674,7 +2674,7 @@
               <w:rPr>
                 <w:sz w:val="16"/>
               </w:rPr>
-              <w:t>Template offline; LLMReasoner (default openai/gpt-oss-20b).</w:t>
+              <w:t>LLMReasoner default (openai/gpt-oss-20b); TemplateReasoner is ablation.</w:t>
             </w:r>
           </w:p>
         </w:tc>
@@ -2722,7 +2722,7 @@
               <w:rPr>
                 <w:sz w:val="16"/>
               </w:rPr>
-              <w:t>Schema, CWE id, cited lines, decision vs evidence.</w:t>
+              <w:t>Schema, CWE id, cited lines, JSON consistency. SAST disagreement is a warning.</w:t>
             </w:r>
           </w:p>
         </w:tc>
@@ -2927,7 +2927,7 @@
         <w:ind w:left="259" w:hanging="173"/>
       </w:pPr>
       <w:r>
-        <w:t>Keep SAST-first LLM routing in the orchestrator (GROQ_API_KEY).</w:t>
+        <w:t>Keep SAST as evidence extraction; Groq LLMReasoner is the default decision path (GROQ_API_KEY required).</w:t>
       </w:r>
     </w:p>
     <w:p>
@@ -2937,7 +2937,7 @@
         <w:ind w:left="259" w:hanging="173"/>
       </w:pPr>
       <w:r>
-        <w:t>Live LLM reasoner is implemented; research trials used Groq openai/gpt-oss-20b.</w:t>
+        <w:t>Live LLM reasoner is the system of record; research trials used Groq openai/gpt-oss-20b (llama-3.1-8b-instant retired).</w:t>
       </w:r>
     </w:p>
     <w:p>
@@ -2947,7 +2947,7 @@
         <w:ind w:left="259" w:hanging="173"/>
       </w:pPr>
       <w:r>
-        <w:t>Validator already checks schema, CWE id, cited lines, and decision vs evidence — it currently fails when the LLM correctly overrides SAST.</w:t>
+        <w:t>Validator checks schema, CWE id, cited lines, and JSON consistency. SAST disagreement is a warning, not a fail.</w:t>
       </w:r>
     </w:p>
     <w:p>
@@ -3007,7 +3007,7 @@
         <w:spacing w:after="80" w:line="259" w:lineRule="auto"/>
       </w:pPr>
       <w:r>
-        <w:t>The thesis has progressed from study of Explainable AI, RAG and agentic systems to a runnable seed-only pipeline for explainable CWE-oriented vulnerability detection. The implemented path combines a curated CWE knowledge store, MiniLM/TF-IDF hybrid retrieval, regex SAST evidence, a template reasoner, an LLM path gated on GROQ_API_KEY or CWE_VULN_LLM_API_KEY, validation, and cost-aware orchestrator routing.</w:t>
+        <w:t>The thesis has progressed from study of Explainable AI, RAG and agentic systems to a runnable live Groq pipeline for explainable CWE-oriented vulnerability detection. The implemented path combines a curated CWE knowledge store, MiniLM/TF-IDF hybrid retrieval, regex SAST evidence, Groq LLMReasoner (GROQ_API_KEY required; CWE_VULN_LLM_API_KEY override), validation that is not tied to SAST agreement, and cost-aware orchestrator routing.</w:t>
       </w:r>
     </w:p>
     <w:p>
@@ -3045,7 +3045,7 @@
                 <w:b/>
                 <w:color w:val="16324F"/>
               </w:rPr>
-              <w:t>Progress summary: XAI → RAG → CWE knowledge → agentic AI → Java seed + SAST baseline → hybrid retrieval → schema → evidence → template reasoner → validator → orchestrator → framework CLI → layered packages → MiniLM embeddings + LLM reasoner → research evaluation on an authored expanded corpus. Live Groq used in trials. Public-benchmark evaluation remains later.</w:t>
+              <w:t>Progress summary: XAI → RAG → CWE knowledge → agentic AI → Java seed + SAST baseline → hybrid retrieval → schema → evidence → template reasoner → validator → orchestrator → framework CLI → layered packages → MiniLM embeddings + LLM reasoner → research evaluation on an authored expanded corpus → live Groq default with validator uncoupled from SAST. Public-benchmark evaluation remains later.</w:t>
             </w:r>
           </w:p>
         </w:tc>

</xml_diff>

<commit_message>
Evaluate the pipeline on a mapped Juliet Java v1.3 subset with measured scores.
NIST’s zip returned 403, so the adapter sparse-clones the official-layout GitHub mirror, scores all ingested units with regex SAST, and records live Groq plus template results only on a documented stratified sample.

Co-authored-by: Cursor <cursoragent@cursor.com>
</commit_message>
<xml_diff>
--- a/Thesis Progress Report_RichaVerma_25MCSS02.docx
+++ b/Thesis Progress Report_RichaVerma_25MCSS02.docx
@@ -744,7 +744,7 @@
         <w:spacing w:after="80" w:line="259" w:lineRule="auto"/>
       </w:pPr>
       <w:r>
-        <w:t>Assignments 1–4 and the wired seed pipeline are implemented (PRs #1–#10), then MiniLM embeddings and a Groq LLM reasoner (embeddings-llm). Research evaluation is complete on an authored expanded Java corpus (36 units: original 12 plus 24 held-out FP/FN traps) — not a public benchmark (not Juliet, OWASP Benchmark, or Big-Vul). The system of record is live Groq openai/gpt-oss-20b. SAST-only and TemplateReasoner scored F1=0 on the 24-unit split and are opt-in ablations, not the default path. GROQ_API_KEY is required. No OpenAI account is required.</w:t>
+        <w:t>Assignments 1–4 and the wired seed pipeline are implemented (PRs #1–#10), then MiniLM embeddings and a Groq LLM reasoner (embeddings-llm). Research evaluation is complete on an authored expanded Java corpus (36 units: original 12 plus 24 held-out FP/FN traps) — that table is not Juliet. A Juliet Java v1.3 mapped-subset eval was run: NIST zip HTTP 403, GitHub mirror used; regex SAST n=20728 P=0.300 R=0.334 F1=0.316; live Groq sample n=72 F1=0.733. The system of record is live Groq openai/gpt-oss-20b. GROQ_API_KEY is required. No OpenAI account is required.</w:t>
       </w:r>
     </w:p>
     <w:tbl>
@@ -1276,7 +1276,7 @@
               <w:rPr>
                 <w:sz w:val="16"/>
               </w:rPr>
-              <w:t>Live research</w:t>
+              <w:t>Juliet subset</w:t>
             </w:r>
           </w:p>
         </w:tc>
@@ -1290,7 +1290,7 @@
               <w:rPr>
                 <w:sz w:val="16"/>
               </w:rPr>
-              <w:t>Authored 36-unit corpus. Live Groq is the system of record. Not a public benchmark.</w:t>
+              <w:t>Authored 36-unit corpus plus measured Juliet Java v1.3 mapped SAST n=20728 / LLM n=72. Not the full 28881 suite.</w:t>
             </w:r>
           </w:p>
         </w:tc>
@@ -1339,7 +1339,7 @@
               <w:br/>
               <w:t xml:space="preserve">  models/          Evidence, RankedHit, ReasoningResult, ValidationReport, metrics</w:t>
               <w:br/>
-              <w:t xml:space="preserve">  dataset/         SeedUnit, load_seed 8/4, load_research_corpus 36</w:t>
+              <w:t xml:space="preserve">  dataset/         SeedUnit, load_seed 8/4, load_research_corpus 36, Juliet adapter</w:t>
               <w:br/>
               <w:t xml:space="preserve">  knowledge/       CWEKnowledgeBase</w:t>
               <w:br/>
@@ -2272,7 +2272,7 @@
         <w:spacing w:after="80" w:line="259" w:lineRule="auto"/>
       </w:pPr>
       <w:r>
-        <w:t>The live pipeline is implemented and runnable: uv sync &amp;&amp; uv run pytest &amp;&amp; uv run cwe-vuln-pipeline (requires GROQ_API_KEY). Assignment 1 detection on 12 units P=R=F1=1.000 (seed-only). Research evaluation on 24 held-out authored traps: SAST/template P=R=F1=0.000 (12 FP / 12 FN, ablation); live Groq then_llm P=0.857 R=1.000 F1=0.923, validator 24/24 (was 2/24 under the old SAST-iff-vulnerable rule). Retrieval on 48 authored queries: hybrid R@1=0.854 MRR=0.917 vs MiniLM 0.812 / 0.894 vs TF-IDF 0.646 / 0.794. Public-benchmark evaluation is not claimed.</w:t>
+        <w:t>The live pipeline is implemented and runnable: uv sync &amp;&amp; uv run pytest &amp;&amp; uv run cwe-vuln-pipeline (requires GROQ_API_KEY). Assignment 1 detection on 12 units P=R=F1=1.000 (seed-only). Research evaluation on 24 held-out authored traps: SAST/template P=R=F1=0.000 (12 FP / 12 FN, ablation); live Groq then_llm P=0.857 R=1.000 F1=0.923, validator 24/24 (was 2/24 under the old SAST-iff-vulnerable rule). Retrieval on 48 authored queries: hybrid R@1=0.854 MRR=0.917 vs MiniLM 0.812 / 0.894 vs TF-IDF 0.646 / 0.794. Juliet Java v1.3 mapped subset (measured): SAST n=20728 P=0.300 R=0.334 F1=0.316; Groq stratified sample n=72 P=0.917 R=0.611 F1=0.733. NIST zip 403; GitHub mirror.</w:t>
       </w:r>
     </w:p>
     <w:tbl>
@@ -2852,7 +2852,7 @@
               <w:rPr>
                 <w:sz w:val="16"/>
               </w:rPr>
-              <w:t>Authored corpus</w:t>
+              <w:t>Juliet subset measured</w:t>
             </w:r>
           </w:p>
         </w:tc>
@@ -2866,7 +2866,7 @@
               <w:rPr>
                 <w:sz w:val="16"/>
               </w:rPr>
-              <w:t>36 units / 24 held-out traps. No Juliet / OWASP Benchmark / Big-Vul numbers.</w:t>
+              <w:t>SAST n=20728 F1=0.316; Groq sample n=72 F1=0.733. Authored 36-unit table is separate.</w:t>
             </w:r>
           </w:p>
         </w:tc>
@@ -2967,7 +2967,7 @@
         <w:ind w:left="259" w:hanging="173"/>
       </w:pPr>
       <w:r>
-        <w:t>Public-benchmark experiments remain out of scope until a labeled external dataset is adopted.</w:t>
+        <w:t>Juliet Java v1.3 mapped-subset evaluation is measured (SAST n=20728; LLM sample n=72). Authored 36-unit scores stay a separate table.</w:t>
       </w:r>
     </w:p>
     <w:p>
@@ -3015,7 +3015,7 @@
         <w:spacing w:after="80" w:line="259" w:lineRule="auto"/>
       </w:pPr>
       <w:r>
-        <w:t>Current work establishes the problem, layered architecture, MiniLM embeddings, an LLM reasoner, and a completed research evaluation on an authored expanded corpus (with limitations: small N, traps written against our regex). Public-benchmark evaluation remains future work and is not reported as done.</w:t>
+        <w:t>Current work establishes the problem, layered architecture, MiniLM embeddings, an LLM reasoner, authored-corpus research evaluation, and a measured Juliet Java v1.3 mapped-subset run (NIST zip 403; SAST n=20728; Groq sample n=72). Do not mix the 36-unit authored table with the Juliet table.</w:t>
       </w:r>
     </w:p>
     <w:tbl>
@@ -3045,7 +3045,7 @@
                 <w:b/>
                 <w:color w:val="16324F"/>
               </w:rPr>
-              <w:t>Progress summary: XAI → RAG → CWE knowledge → agentic AI → Java seed + SAST baseline → hybrid retrieval → schema → evidence → template reasoner → validator → orchestrator → framework CLI → layered packages → MiniLM embeddings + LLM reasoner → research evaluation on an authored expanded corpus → live Groq default with validator uncoupled from SAST. Public-benchmark evaluation remains later.</w:t>
+              <w:t>Progress summary: XAI → RAG → CWE knowledge → agentic AI → Java seed + SAST baseline → hybrid retrieval → schema → evidence → template reasoner → validator → orchestrator → framework CLI → layered packages → MiniLM embeddings + LLM reasoner → research evaluation on an authored expanded corpus → live Groq default with validator uncoupled from SAST → Juliet Java v1.3 mapped-subset eval (SAST n=20728, Groq sample n=72).</w:t>
             </w:r>
           </w:p>
         </w:tc>

</xml_diff>

<commit_message>
Measure the pipeline on six named public Java vulnerability suites.
Give the advisor labeled n and F1 beyond the authored seed: full regex SAST on each ingested corpus and live Groq on documented stratified samples, without claiming 100% novelty.

Co-authored-by: Cursor <cursoragent@cursor.com>
</commit_message>
<xml_diff>
--- a/Thesis Progress Report_RichaVerma_25MCSS02.docx
+++ b/Thesis Progress Report_RichaVerma_25MCSS02.docx
@@ -744,7 +744,7 @@
         <w:spacing w:after="80" w:line="259" w:lineRule="auto"/>
       </w:pPr>
       <w:r>
-        <w:t>Assignments 1–4 and the wired seed pipeline are implemented (PRs #1–#10), then MiniLM embeddings and a Groq LLM reasoner (embeddings-llm). Research evaluation is complete on an authored expanded Java corpus (36 units: original 12 plus 24 held-out FP/FN traps) — that table is not Juliet. A Juliet Java v1.3 mapped-subset eval was run: NIST zip HTTP 403, GitHub mirror used; regex SAST n=20728 P=0.300 R=0.334 F1=0.316; live Groq sample n=72 F1=0.733. The system of record is live Groq openai/gpt-oss-20b. GROQ_API_KEY is required. No OpenAI account is required.</w:t>
+        <w:t>Assignments 1–4 and the wired seed pipeline are implemented (PRs #1–#10), then MiniLM embeddings and a Groq LLM reasoner (embeddings-llm). Research evaluation is complete on an authored expanded Java corpus (36 units: original 12 plus 24 held-out FP/FN traps) — that table is not a public benchmark. Six named Java suites were measured: Juliet SAST n=20728 F1=0.316 / Groq sample n=72 F1=0.733; OWASP n=2740 F1=0.395 / Groq n=12 F1=0.286; Securibench n=119 F1=0.072 / Groq n=12 F1=0.500; find-sec-bugs n=79 F1=0.435 / Groq n=12 F1=0.364; Vul4J n=62 F1=0.244 / Groq n=12 F1=0.000; CVEfixes-Java-slice n=92 F1=0.207 / Groq n=12 F1=0.000. No HTTP 429. LLM samples are not full suites; regex is not CodeQL. Six suites do not prove 100% novelty. The system of record is live Groq openai/gpt-oss-20b. GROQ_API_KEY is required. No OpenAI account is required.</w:t>
       </w:r>
     </w:p>
     <w:tbl>
@@ -1276,7 +1276,7 @@
               <w:rPr>
                 <w:sz w:val="16"/>
               </w:rPr>
-              <w:t>Juliet subset</w:t>
+              <w:t>Six suites measured</w:t>
             </w:r>
           </w:p>
         </w:tc>
@@ -1290,7 +1290,7 @@
               <w:rPr>
                 <w:sz w:val="16"/>
               </w:rPr>
-              <w:t>Authored 36-unit corpus plus measured Juliet Java v1.3 mapped SAST n=20728 / LLM n=72. Not the full 28881 suite.</w:t>
+              <w:t>Authored 36-unit corpus plus six public Java suites (Juliet n=20728 SAST; others in six-benchmark-results.md). Not 100% novelty.</w:t>
             </w:r>
           </w:p>
         </w:tc>
@@ -1339,7 +1339,7 @@
               <w:br/>
               <w:t xml:space="preserve">  models/          Evidence, RankedHit, ReasoningResult, ValidationReport, metrics</w:t>
               <w:br/>
-              <w:t xml:space="preserve">  dataset/         SeedUnit, load_seed 8/4, load_research_corpus 36, Juliet adapter</w:t>
+              <w:t xml:space="preserve">  dataset/         SeedUnit, load_seed 8/4, load_research_corpus 36, six suite adapters</w:t>
               <w:br/>
               <w:t xml:space="preserve">  knowledge/       CWEKnowledgeBase</w:t>
               <w:br/>
@@ -2272,7 +2272,7 @@
         <w:spacing w:after="80" w:line="259" w:lineRule="auto"/>
       </w:pPr>
       <w:r>
-        <w:t>The live pipeline is implemented and runnable: uv sync &amp;&amp; uv run pytest &amp;&amp; uv run cwe-vuln-pipeline (requires GROQ_API_KEY). Assignment 1 detection on 12 units P=R=F1=1.000 (seed-only). Research evaluation on 24 held-out authored traps: SAST/template P=R=F1=0.000 (12 FP / 12 FN, ablation); live Groq then_llm P=0.857 R=1.000 F1=0.923, validator 24/24 (was 2/24 under the old SAST-iff-vulnerable rule). Retrieval on 48 authored queries: hybrid R@1=0.854 MRR=0.917 vs MiniLM 0.812 / 0.894 vs TF-IDF 0.646 / 0.794. Juliet Java v1.3 mapped subset (measured): SAST n=20728 P=0.300 R=0.334 F1=0.316; Groq stratified sample n=72 P=0.917 R=0.611 F1=0.733. NIST zip 403; GitHub mirror.</w:t>
+        <w:t>The live pipeline is implemented and runnable: uv sync &amp;&amp; uv run pytest &amp;&amp; uv run cwe-vuln-pipeline (requires GROQ_API_KEY). Assignment 1 detection on 12 units P=R=F1=1.000 (seed-only). Research evaluation on 24 held-out authored traps: SAST/template P=R=F1=0.000 (12 FP / 12 FN, ablation); live Groq then_llm P=0.857 R=1.000 F1=0.923, validator 24/24 (was 2/24 under the old SAST-iff-vulnerable rule). Retrieval on 48 authored queries: hybrid R@1=0.854 MRR=0.917 vs MiniLM 0.812 / 0.894 vs TF-IDF 0.646 / 0.794. Juliet Java v1.3 mapped subset (measured): SAST n=20728 P=0.300 R=0.334 F1=0.316; Groq stratified sample n=72 P=0.917 R=0.611 F1=0.733. Six-suite table: OWASP n=2740 F1=0.395; Securibench n=119 F1=0.072; find-sec-bugs n=79 F1=0.435; Vul4J n=62 F1=0.244; CVEfixes-Java-slice n=92 F1=0.207. LLM n=12 on those five (F1 0.286 / 0.500 / 0.364 / 0.000 / 0.000). No 429. NIST zip 403; GitHub mirror.</w:t>
       </w:r>
     </w:p>
     <w:tbl>
@@ -2852,7 +2852,7 @@
               <w:rPr>
                 <w:sz w:val="16"/>
               </w:rPr>
-              <w:t>Juliet subset measured</w:t>
+              <w:t>Six suites measured</w:t>
             </w:r>
           </w:p>
         </w:tc>
@@ -2866,7 +2866,7 @@
               <w:rPr>
                 <w:sz w:val="16"/>
               </w:rPr>
-              <w:t>SAST n=20728 F1=0.316; Groq sample n=72 F1=0.733. Authored 36-unit table is separate.</w:t>
+              <w:t>Juliet SAST n=20728 F1=0.316 Groq n=72 F1=0.733; five more suites with exact n. Authored 36-unit table is separate.</w:t>
             </w:r>
           </w:p>
         </w:tc>
@@ -2967,7 +2967,7 @@
         <w:ind w:left="259" w:hanging="173"/>
       </w:pPr>
       <w:r>
-        <w:t>Juliet Java v1.3 mapped-subset evaluation is measured (SAST n=20728; LLM sample n=72). Authored 36-unit scores stay a separate table.</w:t>
+        <w:t>Six public Java suites measured (Juliet SAST n=20728; others exact n in six-benchmark-results.md). LLM samples are not full suites. Authored 36-unit scores stay a separate table.</w:t>
       </w:r>
     </w:p>
     <w:p>
@@ -3015,7 +3015,7 @@
         <w:spacing w:after="80" w:line="259" w:lineRule="auto"/>
       </w:pPr>
       <w:r>
-        <w:t>Current work establishes the problem, layered architecture, MiniLM embeddings, an LLM reasoner, authored-corpus research evaluation, and a measured Juliet Java v1.3 mapped-subset run (NIST zip 403; SAST n=20728; Groq sample n=72). Do not mix the 36-unit authored table with the Juliet table.</w:t>
+        <w:t>Current work establishes the problem, layered architecture, MiniLM embeddings, an LLM reasoner, authored-corpus research evaluation, Juliet Java v1.3 mapped subset, and five additional public Java suites (OWASP Benchmark, Securibench Micro, find-sec-bugs, Vul4J, CVEfixes-Java-slice). Do not mix the 36-unit authored table with the six-suite table.</w:t>
       </w:r>
     </w:p>
     <w:tbl>
@@ -3045,7 +3045,7 @@
                 <w:b/>
                 <w:color w:val="16324F"/>
               </w:rPr>
-              <w:t>Progress summary: XAI → RAG → CWE knowledge → agentic AI → Java seed + SAST baseline → hybrid retrieval → schema → evidence → template reasoner → validator → orchestrator → framework CLI → layered packages → MiniLM embeddings + LLM reasoner → research evaluation on an authored expanded corpus → live Groq default with validator uncoupled from SAST → Juliet Java v1.3 mapped-subset eval (SAST n=20728, Groq sample n=72).</w:t>
+              <w:t>Progress summary: XAI → RAG → CWE knowledge → agentic AI → Java seed + SAST baseline → hybrid retrieval → schema → evidence → template reasoner → validator → orchestrator → framework CLI → layered packages → MiniLM embeddings + LLM reasoner → research evaluation on an authored expanded corpus → live Groq default with validator uncoupled from SAST → Juliet Java v1.3 mapped-subset eval (SAST n=20728, Groq sample n=72) → six public Java suites (OWASP, Securibench, find-sec-bugs, Vul4J, CVEfixes-Java-slice).</w:t>
             </w:r>
           </w:p>
         </w:tc>

</xml_diff>